<commit_message>
Pack 20.4 v2: fix CV template margins + remove empty 3rd page
</commit_message>
<xml_diff>
--- a/templates/docx/cv_template.docx
+++ b/templates/docx/cv_template.docx
@@ -7,7 +7,7 @@
         <w:tblW w:type="auto" w:w="0"/>
         <w:tblLayout w:type="fixed"/>
         <w:tblLook w:firstColumn="1" w:firstRow="1" w:lastColumn="0" w:lastRow="0" w:noHBand="0" w:noVBand="1" w:val="04A0"/>
-        <w:tblW w:w="11906" w:type="dxa"/>
+        <w:tblW w:w="10772" w:type="dxa"/>
         <w:tblBorders>
           <w:top w:val="nil"/>
           <w:left w:val="nil"/>
@@ -18,13 +18,13 @@
         </w:tblBorders>
       </w:tblPr>
       <w:tblGrid>
-        <w:gridCol w:w="4167"/>
-        <w:gridCol w:w="7739"/>
+        <w:gridCol w:w="3770"/>
+        <w:gridCol w:w="7002"/>
       </w:tblGrid>
       <w:tr>
         <w:tc>
           <w:tcPr>
-            <w:tcW w:type="dxa" w:w="4513"/>
+            <w:tcW w:type="dxa" w:w="5386"/>
             <w:shd w:val="clear" w:color="auto" w:fill="1F3A5F"/>
             <w:tcMar>
               <w:top w:w="480" w:type="dxa"/>
@@ -32,7 +32,7 @@
               <w:bottom w:w="480" w:type="dxa"/>
               <w:right w:w="480" w:type="dxa"/>
             </w:tcMar>
-            <w:tcW w:w="4167" w:type="dxa"/>
+            <w:tcW w:w="3770" w:type="dxa"/>
             <w:tcBorders>
               <w:top w:val="nil"/>
               <w:left w:val="nil"/>
@@ -443,14 +443,14 @@
         </w:tc>
         <w:tc>
           <w:tcPr>
-            <w:tcW w:type="dxa" w:w="4513"/>
+            <w:tcW w:type="dxa" w:w="5386"/>
             <w:tcMar>
               <w:top w:w="480" w:type="dxa"/>
               <w:left w:w="540" w:type="dxa"/>
               <w:bottom w:w="480" w:type="dxa"/>
               <w:right w:w="540" w:type="dxa"/>
             </w:tcMar>
-            <w:tcW w:w="7739" w:type="dxa"/>
+            <w:tcW w:w="7002" w:type="dxa"/>
             <w:tcBorders>
               <w:top w:val="nil"/>
               <w:left w:val="nil"/>
@@ -796,7 +796,7 @@
     </w:tbl>
     <w:sectPr>
       <w:pgSz w:w="11906" w:h="16838"/>
-      <w:pgMar w:top="0" w:right="0" w:bottom="0" w:left="0" w:header="720" w:footer="720" w:gutter="0"/>
+      <w:pgMar w:top="850" w:right="567" w:bottom="850" w:left="567" w:header="720" w:footer="720" w:gutter="0"/>
       <w:cols w:space="720"/>
       <w:docGrid w:linePitch="360"/>
     </w:sectPr>

</xml_diff>

<commit_message>
Pack 20.5: CV template with profession block + additional info
</commit_message>
<xml_diff>
--- a/templates/docx/cv_template.docx
+++ b/templates/docx/cv_template.docx
@@ -475,11 +475,16 @@
           </w:p>
           <w:p>
             <w:pPr>
-              <w:spacing w:after="160"/>
+              <w:spacing w:after="0"/>
             </w:pPr>
             <w:r>
               <w:t>{% if application and application.position %}</w:t>
             </w:r>
+          </w:p>
+          <w:p>
+            <w:pPr>
+              <w:spacing w:after="120"/>
+            </w:pPr>
             <w:r>
               <w:rPr>
                 <w:rFonts w:ascii="Calibri" w:hAnsi="Calibri" w:eastAsia="Calibri" w:cs="Calibri"/>
@@ -489,9 +494,6 @@
                 <w:sz w:val="28"/>
               </w:rPr>
               <w:t>{{ application.position.title_ru }}</w:t>
-            </w:r>
-            <w:r>
-              <w:t>{% endif %}</w:t>
             </w:r>
           </w:p>
           <w:p>
@@ -504,7 +506,88 @@
           </w:p>
           <w:p>
             <w:pPr>
-              <w:spacing w:before="320" w:after="160"/>
+              <w:spacing w:after="0"/>
+            </w:pPr>
+            <w:r>
+              <w:t>{% if application.position.profile_description %}</w:t>
+            </w:r>
+          </w:p>
+          <w:p>
+            <w:pPr>
+              <w:spacing w:before="200" w:after="80"/>
+              <w:pBdr>
+                <w:bottom w:val="single" w:sz="10" w:space="4" w:color="1F3A5F"/>
+              </w:pBdr>
+            </w:pPr>
+            <w:r>
+              <w:rPr>
+                <w:rFonts w:ascii="Calibri" w:hAnsi="Calibri" w:eastAsia="Calibri" w:cs="Calibri"/>
+                <w:b/>
+                <w:i w:val="0"/>
+                <w:color w:val="1F3A5F"/>
+                <w:sz w:val="24"/>
+              </w:rPr>
+              <w:t>ПРОФЕССИЯ</w:t>
+            </w:r>
+          </w:p>
+          <w:p>
+            <w:pPr>
+              <w:spacing w:after="160" w:line="312" w:lineRule="auto"/>
+            </w:pPr>
+            <w:r>
+              <w:rPr>
+                <w:rFonts w:ascii="Calibri" w:hAnsi="Calibri" w:eastAsia="Calibri" w:cs="Calibri"/>
+                <w:b w:val="0"/>
+                <w:i w:val="0"/>
+                <w:color w:val="2C2C2C"/>
+                <w:sz w:val="20"/>
+              </w:rPr>
+              <w:t>{{ application.position.profile_description }}</w:t>
+            </w:r>
+          </w:p>
+          <w:p>
+            <w:pPr>
+              <w:spacing w:after="0"/>
+            </w:pPr>
+            <w:r>
+              <w:t>{% endif %}</w:t>
+            </w:r>
+          </w:p>
+          <w:p>
+            <w:pPr>
+              <w:spacing w:after="0"/>
+            </w:pPr>
+            <w:r>
+              <w:t>{% endif %}</w:t>
+            </w:r>
+          </w:p>
+          <w:p>
+            <w:pPr>
+              <w:spacing w:after="0"/>
+            </w:pPr>
+            <w:r>
+              <w:t>{% if not application or not application.position %}</w:t>
+            </w:r>
+          </w:p>
+          <w:p>
+            <w:pPr>
+              <w:spacing w:before="0" w:after="160"/>
+              <w:pBdr>
+                <w:bottom w:val="single" w:sz="12" w:space="4" w:color="1F3A5F"/>
+              </w:pBdr>
+            </w:pPr>
+          </w:p>
+          <w:p>
+            <w:pPr>
+              <w:spacing w:after="0"/>
+            </w:pPr>
+            <w:r>
+              <w:t>{% endif %}</w:t>
+            </w:r>
+          </w:p>
+          <w:p>
+            <w:pPr>
+              <w:spacing w:before="200" w:after="80"/>
               <w:pBdr>
                 <w:bottom w:val="single" w:sz="10" w:space="4" w:color="1F3A5F"/>
               </w:pBdr>
@@ -595,7 +678,7 @@
           </w:p>
           <w:p>
             <w:pPr>
-              <w:spacing w:after="40"/>
+              <w:spacing w:after="0" w:line="300" w:lineRule="auto"/>
               <w:ind w:left="400" w:hanging="240"/>
             </w:pPr>
             <w:r>
@@ -660,7 +743,7 @@
           </w:p>
           <w:p>
             <w:pPr>
-              <w:spacing w:before="320" w:after="160"/>
+              <w:spacing w:before="200" w:after="80"/>
               <w:pBdr>
                 <w:bottom w:val="single" w:sz="10" w:space="4" w:color="1F3A5F"/>
               </w:pBdr>
@@ -781,6 +864,102 @@
                 <w:sz w:val="20"/>
               </w:rPr>
               <w:t>(не указано)</w:t>
+            </w:r>
+          </w:p>
+          <w:p>
+            <w:pPr>
+              <w:spacing w:after="0"/>
+            </w:pPr>
+            <w:r>
+              <w:t>{% endif %}</w:t>
+            </w:r>
+          </w:p>
+          <w:p>
+            <w:pPr>
+              <w:spacing w:before="200" w:after="80"/>
+              <w:pBdr>
+                <w:bottom w:val="single" w:sz="10" w:space="4" w:color="1F3A5F"/>
+              </w:pBdr>
+            </w:pPr>
+            <w:r>
+              <w:rPr>
+                <w:rFonts w:ascii="Calibri" w:hAnsi="Calibri" w:eastAsia="Calibri" w:cs="Calibri"/>
+                <w:b/>
+                <w:i w:val="0"/>
+                <w:color w:val="1F3A5F"/>
+                <w:sz w:val="24"/>
+              </w:rPr>
+              <w:t>ДОПОЛНИТЕЛЬНАЯ ИНФОРМАЦИЯ</w:t>
+            </w:r>
+          </w:p>
+          <w:p>
+            <w:pPr>
+              <w:spacing w:before="80" w:after="80"/>
+              <w:ind w:left="400" w:hanging="240"/>
+            </w:pPr>
+            <w:r>
+              <w:rPr>
+                <w:rFonts w:ascii="Calibri" w:hAnsi="Calibri" w:eastAsia="Calibri" w:cs="Calibri"/>
+                <w:b/>
+                <w:i w:val="0"/>
+                <w:color w:val="1F3A5F"/>
+                <w:sz w:val="20"/>
+              </w:rPr>
+              <w:t xml:space="preserve">•  </w:t>
+            </w:r>
+            <w:r>
+              <w:rPr>
+                <w:rFonts w:ascii="Calibri" w:hAnsi="Calibri" w:eastAsia="Calibri" w:cs="Calibri"/>
+                <w:b w:val="0"/>
+                <w:i w:val="0"/>
+                <w:color w:val="2C2C2C"/>
+                <w:sz w:val="20"/>
+              </w:rPr>
+              <w:t>Готов к удалённой работе и переезду</w:t>
+            </w:r>
+          </w:p>
+          <w:p>
+            <w:pPr>
+              <w:spacing w:after="0"/>
+            </w:pPr>
+            <w:r>
+              <w:t>{% if applicant.languages %}</w:t>
+            </w:r>
+          </w:p>
+          <w:p>
+            <w:pPr>
+              <w:spacing w:before="0" w:after="80"/>
+              <w:ind w:left="400" w:hanging="240"/>
+            </w:pPr>
+            <w:r>
+              <w:rPr>
+                <w:rFonts w:ascii="Calibri" w:hAnsi="Calibri" w:eastAsia="Calibri" w:cs="Calibri"/>
+                <w:b/>
+                <w:i w:val="0"/>
+                <w:color w:val="1F3A5F"/>
+                <w:sz w:val="20"/>
+              </w:rPr>
+              <w:t xml:space="preserve">•  </w:t>
+            </w:r>
+            <w:r>
+              <w:rPr>
+                <w:rFonts w:ascii="Calibri" w:hAnsi="Calibri" w:eastAsia="Calibri" w:cs="Calibri"/>
+                <w:b/>
+                <w:i w:val="0"/>
+                <w:color w:val="2C2C2C"/>
+                <w:sz w:val="20"/>
+              </w:rPr>
+              <w:t xml:space="preserve">Иностранные языки: </w:t>
+            </w:r>
+            <w:r>
+              <w:rPr>
+                <w:rFonts w:ascii="Calibri" w:hAnsi="Calibri" w:eastAsia="Calibri" w:cs="Calibri"/>
+                <w:b w:val="0"/>
+                <w:i w:val="0"/>
+                <w:color w:val="2C2C2C"/>
+                <w:sz w:val="20"/>
+              </w:rPr>
+              <w:t>{{ applicant.languages|join(', ') }}</w:t>
             </w:r>
           </w:p>
           <w:p>

</xml_diff>

<commit_message>
Pack 20.5 + 21.0: CV redesign and seed representatives/addresses
</commit_message>
<xml_diff>
--- a/templates/docx/cv_template.docx
+++ b/templates/docx/cv_template.docx
@@ -894,7 +894,7 @@
           </w:p>
           <w:p>
             <w:pPr>
-              <w:spacing w:before="80" w:after="80"/>
+              <w:spacing w:before="80" w:after="40" w:line="300" w:lineRule="auto"/>
               <w:ind w:left="400" w:hanging="240"/>
             </w:pPr>
             <w:r>
@@ -920,15 +920,59 @@
           </w:p>
           <w:p>
             <w:pPr>
-              <w:spacing w:after="0"/>
+              <w:spacing w:after="40" w:line="300" w:lineRule="auto"/>
+              <w:ind w:left="400" w:hanging="240"/>
             </w:pPr>
             <w:r>
-              <w:t>{% if applicant.languages %}</w:t>
+              <w:rPr>
+                <w:rFonts w:ascii="Calibri" w:hAnsi="Calibri" w:eastAsia="Calibri" w:cs="Calibri"/>
+                <w:b/>
+                <w:i w:val="0"/>
+                <w:color w:val="1F3A5F"/>
+                <w:sz w:val="20"/>
+              </w:rPr>
+              <w:t xml:space="preserve">•  </w:t>
+            </w:r>
+            <w:r>
+              <w:rPr>
+                <w:rFonts w:ascii="Calibri" w:hAnsi="Calibri" w:eastAsia="Calibri" w:cs="Calibri"/>
+                <w:b w:val="0"/>
+                <w:i w:val="0"/>
+                <w:color w:val="2C2C2C"/>
+                <w:sz w:val="20"/>
+              </w:rPr>
+              <w:t>Самозанятый, плательщик налога на профессиональный доход (НПД)</w:t>
             </w:r>
           </w:p>
           <w:p>
             <w:pPr>
-              <w:spacing w:before="0" w:after="80"/>
+              <w:spacing w:after="40" w:line="300" w:lineRule="auto"/>
+              <w:ind w:left="400" w:hanging="240"/>
+            </w:pPr>
+            <w:r>
+              <w:rPr>
+                <w:rFonts w:ascii="Calibri" w:hAnsi="Calibri" w:eastAsia="Calibri" w:cs="Calibri"/>
+                <w:b/>
+                <w:i w:val="0"/>
+                <w:color w:val="1F3A5F"/>
+                <w:sz w:val="20"/>
+              </w:rPr>
+              <w:t xml:space="preserve">•  </w:t>
+            </w:r>
+            <w:r>
+              <w:rPr>
+                <w:rFonts w:ascii="Calibri" w:hAnsi="Calibri" w:eastAsia="Calibri" w:cs="Calibri"/>
+                <w:b w:val="0"/>
+                <w:i w:val="0"/>
+                <w:color w:val="2C2C2C"/>
+                <w:sz w:val="20"/>
+              </w:rPr>
+              <w:t>Опыт работы в распределённых командах, навык самостоятельного планирования рабочего времени</w:t>
+            </w:r>
+          </w:p>
+          <w:p>
+            <w:pPr>
+              <w:spacing w:after="40" w:line="300" w:lineRule="auto"/>
               <w:ind w:left="400" w:hanging="240"/>
             </w:pPr>
             <w:r>
@@ -952,6 +996,9 @@
               <w:t xml:space="preserve">Иностранные языки: </w:t>
             </w:r>
             <w:r>
+              <w:t>{% if applicant.languages %}</w:t>
+            </w:r>
+            <w:r>
               <w:rPr>
                 <w:rFonts w:ascii="Calibri" w:hAnsi="Calibri" w:eastAsia="Calibri" w:cs="Calibri"/>
                 <w:b w:val="0"/>
@@ -961,11 +1008,19 @@
               </w:rPr>
               <w:t>{{ applicant.languages|join(', ') }}</w:t>
             </w:r>
-          </w:p>
-          <w:p>
-            <w:pPr>
-              <w:spacing w:after="0"/>
-            </w:pPr>
+            <w:r>
+              <w:t>{% else %}</w:t>
+            </w:r>
+            <w:r>
+              <w:rPr>
+                <w:rFonts w:ascii="Calibri" w:hAnsi="Calibri" w:eastAsia="Calibri" w:cs="Calibri"/>
+                <w:b w:val="0"/>
+                <w:i w:val="0"/>
+                <w:color w:val="2C2C2C"/>
+                <w:sz w:val="20"/>
+              </w:rPr>
+              <w:t>Русский (свободно), Английский (B2)</w:t>
+            </w:r>
             <w:r>
               <w:t>{% endif %}</w:t>
             </w:r>

</xml_diff>

<commit_message>
fix(cv): wrap НПД line in {%p if SELF_EMPLOYED %} — hide for EMPLOYMENT
CV-шаблон содержал хардкод 'Самозанятый, плательщик НПД' в блоке
'Дополнительная информация', который попадал во ВСЕ CV, включая
EMPLOYMENT-заявки — где это противоречит трудовому договору
(Дарья Жучкова и подобные кейсы, ловится инспектором).

Решение: обернуть параграф в {%p if 'SELF_EMPLOYED' in
(application.application_type|string) %} ... {%p endif %} (docxtpl
%p удаляет весь параграф с тегом, не оставляя пустой строки/буллита).

Бэкап шаблона: cv_template.docx.bak_pre_cv_remove_npd_20260623_120750
Патчер идемпотентный (Правило 34).
</commit_message>
<xml_diff>
--- a/templates/docx/cv_template.docx
+++ b/templates/docx/cv_template.docx
@@ -924,6 +924,15 @@
               <w:ind w:left="400" w:hanging="240"/>
             </w:pPr>
             <w:r>
+              <w:t xml:space="preserve">{%p if 'SELF_EMPLOYED' in (application.application_type|string) %}</w:t>
+            </w:r>
+          </w:p>
+          <w:p>
+            <w:pPr>
+              <w:spacing w:after="40" w:line="300" w:lineRule="auto"/>
+              <w:ind w:left="400" w:hanging="240"/>
+            </w:pPr>
+            <w:r>
               <w:rPr>
                 <w:rFonts w:ascii="Calibri" w:hAnsi="Calibri" w:eastAsia="Calibri" w:cs="Calibri"/>
                 <w:b/>
@@ -942,6 +951,15 @@
                 <w:sz w:val="20"/>
               </w:rPr>
               <w:t>Самозанятый, плательщик налога на профессиональный доход (НПД)</w:t>
+            </w:r>
+          </w:p>
+          <w:p>
+            <w:pPr>
+              <w:spacing w:after="40" w:line="300" w:lineRule="auto"/>
+              <w:ind w:left="400" w:hanging="240"/>
+            </w:pPr>
+            <w:r>
+              <w:t xml:space="preserve">{%p endif %}</w:t>
             </w:r>
           </w:p>
           <w:p>

</xml_diff>

<commit_message>
feat(cv): minimal single-column template for Spanish visa submission
Заменён двухколонный CV-шаблон с цветными акцентами (Pack 20.x) на
минималистичный одноколоночный в стиле классического CV для подачи
в Испании. Принимающие в визовых центрах жаловались на яркий
двухколонный формат.

Изменения:
- Calibri 11pt, без цветов кроме muted gray для подзаголовков
- Одна колонка, тонкая серая линия под шапкой
- Имя по центру, должность курсивом под ним, контакты строкой
- Даты опыта выровнены вправо tab-stop'ом
- Sentence case в заголовках секций
- Условный блок про НПД встроен в шаблон ({%p if SELF_EMPLOYED %})

Все Jinja2-переменные сохранены, пайплайн рендера не меняется.
Версия зашита в core_properties.comments=minimal_cv_v1_20260623
для идемпотентности патчера.
</commit_message>
<xml_diff>
--- a/templates/docx/cv_template.docx
+++ b/templates/docx/cv_template.docx
@@ -2,1053 +2,475 @@
 <file path=word/document.xml><?xml version="1.0" encoding="utf-8"?>
 <w:document xmlns:wpc="http://schemas.microsoft.com/office/word/2010/wordprocessingCanvas" xmlns:mo="http://schemas.microsoft.com/office/mac/office/2008/main" xmlns:mc="http://schemas.openxmlformats.org/markup-compatibility/2006" xmlns:mv="urn:schemas-microsoft-com:mac:vml" xmlns:o="urn:schemas-microsoft-com:office:office" xmlns:r="http://schemas.openxmlformats.org/officeDocument/2006/relationships" xmlns:m="http://schemas.openxmlformats.org/officeDocument/2006/math" xmlns:v="urn:schemas-microsoft-com:vml" xmlns:wp14="http://schemas.microsoft.com/office/word/2010/wordprocessingDrawing" xmlns:wp="http://schemas.openxmlformats.org/drawingml/2006/wordprocessingDrawing" xmlns:w10="urn:schemas-microsoft-com:office:word" xmlns:w="http://schemas.openxmlformats.org/wordprocessingml/2006/main" xmlns:w14="http://schemas.microsoft.com/office/word/2010/wordml" xmlns:wpg="http://schemas.microsoft.com/office/word/2010/wordprocessingGroup" xmlns:wpi="http://schemas.microsoft.com/office/word/2010/wordprocessingInk" xmlns:wne="http://schemas.microsoft.com/office/word/2006/wordml" xmlns:wps="http://schemas.microsoft.com/office/word/2010/wordprocessingShape" mc:Ignorable="w14 wp14">
   <w:body>
-    <w:tbl>
-      <w:tblPr>
-        <w:tblW w:type="auto" w:w="0"/>
-        <w:tblLayout w:type="fixed"/>
-        <w:tblLook w:firstColumn="1" w:firstRow="1" w:lastColumn="0" w:lastRow="0" w:noHBand="0" w:noVBand="1" w:val="04A0"/>
-        <w:tblW w:w="10772" w:type="dxa"/>
-        <w:tblBorders>
-          <w:top w:val="nil"/>
-          <w:left w:val="nil"/>
-          <w:bottom w:val="nil"/>
-          <w:right w:val="nil"/>
-          <w:insideH w:val="nil"/>
-          <w:insideV w:val="nil"/>
-        </w:tblBorders>
-      </w:tblPr>
-      <w:tblGrid>
-        <w:gridCol w:w="3770"/>
-        <w:gridCol w:w="7002"/>
-      </w:tblGrid>
-      <w:tr>
-        <w:tc>
-          <w:tcPr>
-            <w:tcW w:type="dxa" w:w="5386"/>
-            <w:shd w:val="clear" w:color="auto" w:fill="1F3A5F"/>
-            <w:tcMar>
-              <w:top w:w="480" w:type="dxa"/>
-              <w:left w:w="480" w:type="dxa"/>
-              <w:bottom w:w="480" w:type="dxa"/>
-              <w:right w:w="480" w:type="dxa"/>
-            </w:tcMar>
-            <w:tcW w:w="3770" w:type="dxa"/>
-            <w:tcBorders>
-              <w:top w:val="nil"/>
-              <w:left w:val="nil"/>
-              <w:bottom w:val="nil"/>
-              <w:right w:val="nil"/>
-            </w:tcBorders>
-          </w:tcPr>
-          <w:p>
-            <w:pPr>
-              <w:spacing w:before="280" w:after="120"/>
-              <w:pBdr>
-                <w:bottom w:val="single" w:sz="6" w:space="4" w:color="FFFFFF"/>
-              </w:pBdr>
-            </w:pPr>
-            <w:r>
-              <w:rPr>
-                <w:rFonts w:ascii="Calibri" w:hAnsi="Calibri" w:eastAsia="Calibri" w:cs="Calibri"/>
-                <w:b/>
-                <w:i w:val="0"/>
-                <w:color w:val="FFFFFF"/>
-                <w:sz w:val="20"/>
-              </w:rPr>
-              <w:t>КОНТАКТЫ</w:t>
-            </w:r>
-          </w:p>
-          <w:p>
-            <w:pPr>
-              <w:spacing w:after="80"/>
-            </w:pPr>
-            <w:r>
-              <w:rPr>
-                <w:rFonts w:ascii="Calibri" w:hAnsi="Calibri" w:eastAsia="Calibri" w:cs="Calibri"/>
-                <w:b/>
-                <w:i w:val="0"/>
-                <w:color w:val="FFFFFF"/>
-                <w:sz w:val="16"/>
-              </w:rPr>
-              <w:t>Телефон</w:t>
-            </w:r>
-          </w:p>
-          <w:p>
-            <w:pPr>
-              <w:spacing w:after="160"/>
-            </w:pPr>
-            <w:r>
-              <w:rPr>
-                <w:rFonts w:ascii="Calibri" w:hAnsi="Calibri" w:eastAsia="Calibri" w:cs="Calibri"/>
-                <w:b w:val="0"/>
-                <w:i w:val="0"/>
-                <w:color w:val="FFFFFF"/>
-                <w:sz w:val="20"/>
-              </w:rPr>
-              <w:t>{{ applicant.phone }}</w:t>
-            </w:r>
-          </w:p>
-          <w:p>
-            <w:pPr>
-              <w:spacing w:after="80"/>
-            </w:pPr>
-            <w:r>
-              <w:rPr>
-                <w:rFonts w:ascii="Calibri" w:hAnsi="Calibri" w:eastAsia="Calibri" w:cs="Calibri"/>
-                <w:b/>
-                <w:i w:val="0"/>
-                <w:color w:val="FFFFFF"/>
-                <w:sz w:val="16"/>
-              </w:rPr>
-              <w:t>Email</w:t>
-            </w:r>
-          </w:p>
-          <w:p>
-            <w:pPr>
-              <w:spacing w:after="240"/>
-            </w:pPr>
-            <w:r>
-              <w:rPr>
-                <w:rFonts w:ascii="Calibri" w:hAnsi="Calibri" w:eastAsia="Calibri" w:cs="Calibri"/>
-                <w:b w:val="0"/>
-                <w:i w:val="0"/>
-                <w:color w:val="FFFFFF"/>
-                <w:sz w:val="20"/>
-              </w:rPr>
-              <w:t>{{ applicant.email }}</w:t>
-            </w:r>
-          </w:p>
-          <w:p>
-            <w:pPr>
-              <w:spacing w:before="280" w:after="120"/>
-              <w:pBdr>
-                <w:bottom w:val="single" w:sz="6" w:space="4" w:color="FFFFFF"/>
-              </w:pBdr>
-            </w:pPr>
-            <w:r>
-              <w:rPr>
-                <w:rFonts w:ascii="Calibri" w:hAnsi="Calibri" w:eastAsia="Calibri" w:cs="Calibri"/>
-                <w:b/>
-                <w:i w:val="0"/>
-                <w:color w:val="FFFFFF"/>
-                <w:sz w:val="20"/>
-              </w:rPr>
-              <w:t>ЛИЧНОЕ</w:t>
-            </w:r>
-          </w:p>
-          <w:p>
-            <w:pPr>
-              <w:spacing w:after="80"/>
-            </w:pPr>
-            <w:r>
-              <w:rPr>
-                <w:rFonts w:ascii="Calibri" w:hAnsi="Calibri" w:eastAsia="Calibri" w:cs="Calibri"/>
-                <w:b/>
-                <w:i w:val="0"/>
-                <w:color w:val="FFFFFF"/>
-                <w:sz w:val="16"/>
-              </w:rPr>
-              <w:t>Дата рождения</w:t>
-            </w:r>
-          </w:p>
-          <w:p>
-            <w:pPr>
-              <w:spacing w:after="160"/>
-            </w:pPr>
-            <w:r>
-              <w:rPr>
-                <w:rFonts w:ascii="Calibri" w:hAnsi="Calibri" w:eastAsia="Calibri" w:cs="Calibri"/>
-                <w:b w:val="0"/>
-                <w:i w:val="0"/>
-                <w:color w:val="FFFFFF"/>
-                <w:sz w:val="20"/>
-              </w:rPr>
-              <w:t>{{ fmt_date_ru(applicant.birth_date) }}</w:t>
-            </w:r>
-          </w:p>
-          <w:p>
-            <w:pPr>
-              <w:spacing w:after="80"/>
-            </w:pPr>
-            <w:r>
-              <w:rPr>
-                <w:rFonts w:ascii="Calibri" w:hAnsi="Calibri" w:eastAsia="Calibri" w:cs="Calibri"/>
-                <w:b/>
-                <w:i w:val="0"/>
-                <w:color w:val="FFFFFF"/>
-                <w:sz w:val="16"/>
-              </w:rPr>
-              <w:t>Гражданство</w:t>
-            </w:r>
-          </w:p>
-          <w:p>
-            <w:pPr>
-              <w:spacing w:after="240"/>
-            </w:pPr>
-            <w:r>
-              <w:rPr>
-                <w:rFonts w:ascii="Calibri" w:hAnsi="Calibri" w:eastAsia="Calibri" w:cs="Calibri"/>
-                <w:b w:val="0"/>
-                <w:i w:val="0"/>
-                <w:color w:val="FFFFFF"/>
-                <w:sz w:val="20"/>
-              </w:rPr>
-              <w:t>{{ applicant.nationality_ru }}</w:t>
-            </w:r>
-          </w:p>
-          <w:p>
-            <w:pPr>
-              <w:spacing w:before="280" w:after="120"/>
-              <w:pBdr>
-                <w:bottom w:val="single" w:sz="6" w:space="4" w:color="FFFFFF"/>
-              </w:pBdr>
-            </w:pPr>
-            <w:r>
-              <w:rPr>
-                <w:rFonts w:ascii="Calibri" w:hAnsi="Calibri" w:eastAsia="Calibri" w:cs="Calibri"/>
-                <w:b/>
-                <w:i w:val="0"/>
-                <w:color w:val="FFFFFF"/>
-                <w:sz w:val="20"/>
-              </w:rPr>
-              <w:t>ОБРАЗОВАНИЕ</w:t>
-            </w:r>
-          </w:p>
-          <w:p>
-            <w:pPr>
-              <w:spacing w:after="0"/>
-            </w:pPr>
-            <w:r>
-              <w:t>{% for edu in applicant.education %}</w:t>
-            </w:r>
-          </w:p>
-          <w:p>
-            <w:pPr>
-              <w:spacing w:after="80"/>
-            </w:pPr>
-            <w:r>
-              <w:rPr>
-                <w:rFonts w:ascii="Calibri" w:hAnsi="Calibri" w:eastAsia="Calibri" w:cs="Calibri"/>
-                <w:b/>
-                <w:i w:val="0"/>
-                <w:color w:val="FFFFFF"/>
-                <w:sz w:val="20"/>
-              </w:rPr>
-              <w:t>{{ edu.graduation_year }}</w:t>
-            </w:r>
-          </w:p>
-          <w:p>
-            <w:pPr>
-              <w:spacing w:after="40"/>
-            </w:pPr>
-            <w:r>
-              <w:rPr>
-                <w:rFonts w:ascii="Calibri" w:hAnsi="Calibri" w:eastAsia="Calibri" w:cs="Calibri"/>
-                <w:b w:val="0"/>
-                <w:i/>
-                <w:color w:val="FFFFFF"/>
-                <w:sz w:val="18"/>
-              </w:rPr>
-              <w:t>{{ edu.degree }}</w:t>
-            </w:r>
-          </w:p>
-          <w:p>
-            <w:pPr>
-              <w:spacing w:after="40"/>
-            </w:pPr>
-            <w:r>
-              <w:rPr>
-                <w:rFonts w:ascii="Calibri" w:hAnsi="Calibri" w:eastAsia="Calibri" w:cs="Calibri"/>
-                <w:b w:val="0"/>
-                <w:i w:val="0"/>
-                <w:color w:val="FFFFFF"/>
-                <w:sz w:val="18"/>
-              </w:rPr>
-              <w:t>{{ edu.specialty }}</w:t>
-            </w:r>
-          </w:p>
-          <w:p>
-            <w:pPr>
-              <w:spacing w:after="160"/>
-            </w:pPr>
-            <w:r>
-              <w:rPr>
-                <w:rFonts w:ascii="Calibri" w:hAnsi="Calibri" w:eastAsia="Calibri" w:cs="Calibri"/>
-                <w:b w:val="0"/>
-                <w:i w:val="0"/>
-                <w:color w:val="FFFFFF"/>
-                <w:sz w:val="16"/>
-              </w:rPr>
-              <w:t>{{ edu.institution }}</w:t>
-            </w:r>
-          </w:p>
-          <w:p>
-            <w:pPr>
-              <w:spacing w:after="0"/>
-            </w:pPr>
-            <w:r>
-              <w:t>{% endfor %}</w:t>
-            </w:r>
-          </w:p>
-          <w:p>
-            <w:pPr>
-              <w:spacing w:after="0"/>
-            </w:pPr>
-            <w:r>
-              <w:t>{% if application and application.position and application.position.tags %}</w:t>
-            </w:r>
-          </w:p>
-          <w:p>
-            <w:pPr>
-              <w:spacing w:before="280" w:after="120"/>
-              <w:pBdr>
-                <w:bottom w:val="single" w:sz="6" w:space="4" w:color="FFFFFF"/>
-              </w:pBdr>
-            </w:pPr>
-            <w:r>
-              <w:rPr>
-                <w:rFonts w:ascii="Calibri" w:hAnsi="Calibri" w:eastAsia="Calibri" w:cs="Calibri"/>
-                <w:b/>
-                <w:i w:val="0"/>
-                <w:color w:val="FFFFFF"/>
-                <w:sz w:val="20"/>
-              </w:rPr>
-              <w:t>НАВЫКИ</w:t>
-            </w:r>
-          </w:p>
-          <w:p>
-            <w:pPr>
-              <w:spacing w:after="0"/>
-            </w:pPr>
-            <w:r>
-              <w:t>{% for tag in application.position.tags %}</w:t>
-            </w:r>
-          </w:p>
-          <w:p>
-            <w:pPr>
-              <w:spacing w:after="40"/>
-            </w:pPr>
-            <w:r>
-              <w:rPr>
-                <w:rFonts w:ascii="Calibri" w:hAnsi="Calibri" w:eastAsia="Calibri" w:cs="Calibri"/>
-                <w:b w:val="0"/>
-                <w:i w:val="0"/>
-                <w:color w:val="FFFFFF"/>
-                <w:sz w:val="20"/>
-              </w:rPr>
-              <w:t xml:space="preserve">• </w:t>
-            </w:r>
-            <w:r>
-              <w:rPr>
-                <w:rFonts w:ascii="Calibri" w:hAnsi="Calibri" w:eastAsia="Calibri" w:cs="Calibri"/>
-                <w:b w:val="0"/>
-                <w:i w:val="0"/>
-                <w:color w:val="FFFFFF"/>
-                <w:sz w:val="20"/>
-              </w:rPr>
-              <w:t>{{ tag }}</w:t>
-            </w:r>
-          </w:p>
-          <w:p>
-            <w:pPr>
-              <w:spacing w:after="0"/>
-            </w:pPr>
-            <w:r>
-              <w:t>{% endfor %}</w:t>
-            </w:r>
-          </w:p>
-          <w:p>
-            <w:pPr>
-              <w:spacing w:after="0"/>
-            </w:pPr>
-            <w:r>
-              <w:t>{% endif %}</w:t>
-            </w:r>
-          </w:p>
-          <w:p>
-            <w:pPr>
-              <w:spacing w:after="0"/>
-            </w:pPr>
-            <w:r>
-              <w:t>{% if applicant.languages %}</w:t>
-            </w:r>
-          </w:p>
-          <w:p>
-            <w:pPr>
-              <w:spacing w:before="280" w:after="120"/>
-              <w:pBdr>
-                <w:bottom w:val="single" w:sz="6" w:space="4" w:color="FFFFFF"/>
-              </w:pBdr>
-            </w:pPr>
-            <w:r>
-              <w:rPr>
-                <w:rFonts w:ascii="Calibri" w:hAnsi="Calibri" w:eastAsia="Calibri" w:cs="Calibri"/>
-                <w:b/>
-                <w:i w:val="0"/>
-                <w:color w:val="FFFFFF"/>
-                <w:sz w:val="20"/>
-              </w:rPr>
-              <w:t>ЯЗЫКИ</w:t>
-            </w:r>
-          </w:p>
-          <w:p>
-            <w:pPr>
-              <w:spacing w:after="0"/>
-            </w:pPr>
-            <w:r>
-              <w:t>{% for lang in applicant.languages %}</w:t>
-            </w:r>
-          </w:p>
-          <w:p>
-            <w:pPr>
-              <w:spacing w:after="40"/>
-            </w:pPr>
-            <w:r>
-              <w:rPr>
-                <w:rFonts w:ascii="Calibri" w:hAnsi="Calibri" w:eastAsia="Calibri" w:cs="Calibri"/>
-                <w:b w:val="0"/>
-                <w:i w:val="0"/>
-                <w:color w:val="FFFFFF"/>
-                <w:sz w:val="20"/>
-              </w:rPr>
-              <w:t xml:space="preserve">• </w:t>
-            </w:r>
-            <w:r>
-              <w:rPr>
-                <w:rFonts w:ascii="Calibri" w:hAnsi="Calibri" w:eastAsia="Calibri" w:cs="Calibri"/>
-                <w:b w:val="0"/>
-                <w:i w:val="0"/>
-                <w:color w:val="FFFFFF"/>
-                <w:sz w:val="20"/>
-              </w:rPr>
-              <w:t>{{ lang }}</w:t>
-            </w:r>
-          </w:p>
-          <w:p>
-            <w:pPr>
-              <w:spacing w:after="0"/>
-            </w:pPr>
-            <w:r>
-              <w:t>{% endfor %}</w:t>
-            </w:r>
-          </w:p>
-          <w:p>
-            <w:pPr>
-              <w:spacing w:after="0"/>
-            </w:pPr>
-            <w:r>
-              <w:t>{% endif %}</w:t>
-            </w:r>
-          </w:p>
-        </w:tc>
-        <w:tc>
-          <w:tcPr>
-            <w:tcW w:type="dxa" w:w="5386"/>
-            <w:tcMar>
-              <w:top w:w="480" w:type="dxa"/>
-              <w:left w:w="540" w:type="dxa"/>
-              <w:bottom w:w="480" w:type="dxa"/>
-              <w:right w:w="540" w:type="dxa"/>
-            </w:tcMar>
-            <w:tcW w:w="7002" w:type="dxa"/>
-            <w:tcBorders>
-              <w:top w:val="nil"/>
-              <w:left w:val="nil"/>
-              <w:bottom w:val="nil"/>
-              <w:right w:val="nil"/>
-            </w:tcBorders>
-          </w:tcPr>
-          <w:p>
-            <w:pPr>
-              <w:spacing w:before="0" w:after="40"/>
-            </w:pPr>
-            <w:r>
-              <w:rPr>
-                <w:rFonts w:ascii="Calibri" w:hAnsi="Calibri" w:eastAsia="Calibri" w:cs="Calibri"/>
-                <w:b/>
-                <w:i w:val="0"/>
-                <w:color w:val="1F3A5F"/>
-                <w:sz w:val="48"/>
-              </w:rPr>
-              <w:t>{{ applicant.full_name_native }}</w:t>
-            </w:r>
-          </w:p>
-          <w:p>
-            <w:pPr>
-              <w:spacing w:after="0"/>
-            </w:pPr>
-            <w:r>
-              <w:t>{% if application and application.position %}</w:t>
-            </w:r>
-          </w:p>
-          <w:p>
-            <w:pPr>
-              <w:spacing w:after="120"/>
-            </w:pPr>
-            <w:r>
-              <w:rPr>
-                <w:rFonts w:ascii="Calibri" w:hAnsi="Calibri" w:eastAsia="Calibri" w:cs="Calibri"/>
-                <w:b w:val="0"/>
-                <w:i/>
-                <w:color w:val="6B7280"/>
-                <w:sz w:val="28"/>
-              </w:rPr>
-              <w:t>{{ application.position.title_ru }}</w:t>
-            </w:r>
-          </w:p>
-          <w:p>
-            <w:pPr>
-              <w:spacing w:before="0" w:after="160"/>
-              <w:pBdr>
-                <w:bottom w:val="single" w:sz="12" w:space="4" w:color="1F3A5F"/>
-              </w:pBdr>
-            </w:pPr>
-          </w:p>
-          <w:p>
-            <w:pPr>
-              <w:spacing w:after="0"/>
-            </w:pPr>
-            <w:r>
-              <w:t>{% if application.position.profile_description %}</w:t>
-            </w:r>
-          </w:p>
-          <w:p>
-            <w:pPr>
-              <w:spacing w:before="200" w:after="80"/>
-              <w:pBdr>
-                <w:bottom w:val="single" w:sz="10" w:space="4" w:color="1F3A5F"/>
-              </w:pBdr>
-            </w:pPr>
-            <w:r>
-              <w:rPr>
-                <w:rFonts w:ascii="Calibri" w:hAnsi="Calibri" w:eastAsia="Calibri" w:cs="Calibri"/>
-                <w:b/>
-                <w:i w:val="0"/>
-                <w:color w:val="1F3A5F"/>
-                <w:sz w:val="24"/>
-              </w:rPr>
-              <w:t>ПРОФЕССИЯ</w:t>
-            </w:r>
-          </w:p>
-          <w:p>
-            <w:pPr>
-              <w:spacing w:after="160" w:line="312" w:lineRule="auto"/>
-            </w:pPr>
-            <w:r>
-              <w:rPr>
-                <w:rFonts w:ascii="Calibri" w:hAnsi="Calibri" w:eastAsia="Calibri" w:cs="Calibri"/>
-                <w:b w:val="0"/>
-                <w:i w:val="0"/>
-                <w:color w:val="2C2C2C"/>
-                <w:sz w:val="20"/>
-              </w:rPr>
-              <w:t>{{ application.position.profile_description }}</w:t>
-            </w:r>
-          </w:p>
-          <w:p>
-            <w:pPr>
-              <w:spacing w:after="0"/>
-            </w:pPr>
-            <w:r>
-              <w:t>{% endif %}</w:t>
-            </w:r>
-          </w:p>
-          <w:p>
-            <w:pPr>
-              <w:spacing w:after="0"/>
-            </w:pPr>
-            <w:r>
-              <w:t>{% endif %}</w:t>
-            </w:r>
-          </w:p>
-          <w:p>
-            <w:pPr>
-              <w:spacing w:after="0"/>
-            </w:pPr>
-            <w:r>
-              <w:t>{% if not application or not application.position %}</w:t>
-            </w:r>
-          </w:p>
-          <w:p>
-            <w:pPr>
-              <w:spacing w:before="0" w:after="160"/>
-              <w:pBdr>
-                <w:bottom w:val="single" w:sz="12" w:space="4" w:color="1F3A5F"/>
-              </w:pBdr>
-            </w:pPr>
-          </w:p>
-          <w:p>
-            <w:pPr>
-              <w:spacing w:after="0"/>
-            </w:pPr>
-            <w:r>
-              <w:t>{% endif %}</w:t>
-            </w:r>
-          </w:p>
-          <w:p>
-            <w:pPr>
-              <w:spacing w:before="200" w:after="80"/>
-              <w:pBdr>
-                <w:bottom w:val="single" w:sz="10" w:space="4" w:color="1F3A5F"/>
-              </w:pBdr>
-            </w:pPr>
-            <w:r>
-              <w:rPr>
-                <w:rFonts w:ascii="Calibri" w:hAnsi="Calibri" w:eastAsia="Calibri" w:cs="Calibri"/>
-                <w:b/>
-                <w:i w:val="0"/>
-                <w:color w:val="1F3A5F"/>
-                <w:sz w:val="24"/>
-              </w:rPr>
-              <w:t>ОПЫТ РАБОТЫ</w:t>
-            </w:r>
-          </w:p>
-          <w:p>
-            <w:pPr>
-              <w:spacing w:after="0"/>
-            </w:pPr>
-            <w:r>
-              <w:t>{% if applicant.work_history %}{% for job in applicant.work_history %}</w:t>
-            </w:r>
-          </w:p>
-          <w:p>
-            <w:pPr>
-              <w:spacing w:before="160" w:after="40"/>
-              <w:ind w:left="240"/>
-              <w:pBdr>
-                <w:left w:val="single" w:sz="24" w:space="6" w:color="1F3A5F"/>
-              </w:pBdr>
-            </w:pPr>
-            <w:r>
-              <w:rPr>
-                <w:rFonts w:ascii="Calibri" w:hAnsi="Calibri" w:eastAsia="Calibri" w:cs="Calibri"/>
-                <w:b/>
-                <w:i w:val="0"/>
-                <w:color w:val="6B7280"/>
-                <w:sz w:val="20"/>
-              </w:rPr>
-              <w:t>{{ job.period_start }} – {{ job.period_end }}</w:t>
-            </w:r>
-          </w:p>
-          <w:p>
-            <w:pPr>
-              <w:spacing w:after="40"/>
-              <w:ind w:left="240"/>
-              <w:pBdr>
-                <w:left w:val="single" w:sz="24" w:space="6" w:color="1F3A5F"/>
-              </w:pBdr>
-            </w:pPr>
-            <w:r>
-              <w:rPr>
-                <w:rFonts w:ascii="Calibri" w:hAnsi="Calibri" w:eastAsia="Calibri" w:cs="Calibri"/>
-                <w:b/>
-                <w:i w:val="0"/>
-                <w:color w:val="1F3A5F"/>
-                <w:sz w:val="24"/>
-              </w:rPr>
-              <w:t>{{ job.position }}</w:t>
-            </w:r>
-          </w:p>
-          <w:p>
-            <w:pPr>
-              <w:spacing w:after="120"/>
-              <w:ind w:left="240"/>
-              <w:pBdr>
-                <w:left w:val="single" w:sz="24" w:space="6" w:color="1F3A5F"/>
-              </w:pBdr>
-            </w:pPr>
-            <w:r>
-              <w:rPr>
-                <w:rFonts w:ascii="Calibri" w:hAnsi="Calibri" w:eastAsia="Calibri" w:cs="Calibri"/>
-                <w:b w:val="0"/>
-                <w:i/>
-                <w:color w:val="2C2C2C"/>
-                <w:sz w:val="20"/>
-              </w:rPr>
-              <w:t>{{ job.company }}</w:t>
-            </w:r>
-          </w:p>
-          <w:p>
-            <w:pPr>
-              <w:spacing w:after="0"/>
-            </w:pPr>
-            <w:r>
-              <w:t>{% for duty in job.duties %}</w:t>
-            </w:r>
-          </w:p>
-          <w:p>
-            <w:pPr>
-              <w:spacing w:after="0" w:line="300" w:lineRule="auto"/>
-              <w:ind w:left="400" w:hanging="240"/>
-            </w:pPr>
-            <w:r>
-              <w:rPr>
-                <w:rFonts w:ascii="Calibri" w:hAnsi="Calibri" w:eastAsia="Calibri" w:cs="Calibri"/>
-                <w:b/>
-                <w:i w:val="0"/>
-                <w:color w:val="1F3A5F"/>
-                <w:sz w:val="20"/>
-              </w:rPr>
-              <w:t xml:space="preserve">•  </w:t>
-            </w:r>
-            <w:r>
-              <w:rPr>
-                <w:rFonts w:ascii="Calibri" w:hAnsi="Calibri" w:eastAsia="Calibri" w:cs="Calibri"/>
-                <w:b w:val="0"/>
-                <w:i w:val="0"/>
-                <w:color w:val="2C2C2C"/>
-                <w:sz w:val="20"/>
-              </w:rPr>
-              <w:t>{{ duty }}</w:t>
-            </w:r>
-          </w:p>
-          <w:p>
-            <w:pPr>
-              <w:spacing w:after="0"/>
-            </w:pPr>
-            <w:r>
-              <w:t>{% endfor %}</w:t>
-            </w:r>
-          </w:p>
-          <w:p>
-            <w:pPr>
-              <w:spacing w:after="0"/>
-            </w:pPr>
-            <w:r>
-              <w:t>{% endfor %}{% else %}</w:t>
-            </w:r>
-          </w:p>
-          <w:p>
-            <w:pPr>
-              <w:spacing w:after="0"/>
-            </w:pPr>
-            <w:r>
-              <w:rPr>
-                <w:rFonts w:ascii="Calibri" w:hAnsi="Calibri" w:eastAsia="Calibri" w:cs="Calibri"/>
-                <w:b w:val="0"/>
-                <w:i/>
-                <w:color w:val="6B7280"/>
-                <w:sz w:val="20"/>
-              </w:rPr>
-              <w:t>(не указано)</w:t>
-            </w:r>
-          </w:p>
-          <w:p>
-            <w:pPr>
-              <w:spacing w:after="0"/>
-            </w:pPr>
-            <w:r>
-              <w:t>{% endif %}</w:t>
-            </w:r>
-          </w:p>
-          <w:p>
-            <w:pPr>
-              <w:spacing w:before="200" w:after="80"/>
-              <w:pBdr>
-                <w:bottom w:val="single" w:sz="10" w:space="4" w:color="1F3A5F"/>
-              </w:pBdr>
-            </w:pPr>
-            <w:r>
-              <w:rPr>
-                <w:rFonts w:ascii="Calibri" w:hAnsi="Calibri" w:eastAsia="Calibri" w:cs="Calibri"/>
-                <w:b/>
-                <w:i w:val="0"/>
-                <w:color w:val="1F3A5F"/>
-                <w:sz w:val="24"/>
-              </w:rPr>
-              <w:t>ОБРАЗОВАНИЕ</w:t>
-            </w:r>
-          </w:p>
-          <w:p>
-            <w:pPr>
-              <w:spacing w:after="0"/>
-            </w:pPr>
-            <w:r>
-              <w:t>{% if applicant.education %}{% for edu in applicant.education %}</w:t>
-            </w:r>
-          </w:p>
-          <w:p>
-            <w:pPr>
-              <w:spacing w:before="120" w:after="40"/>
-              <w:ind w:left="240"/>
-              <w:pBdr>
-                <w:left w:val="single" w:sz="24" w:space="6" w:color="1F3A5F"/>
-              </w:pBdr>
-            </w:pPr>
-            <w:r>
-              <w:rPr>
-                <w:rFonts w:ascii="Calibri" w:hAnsi="Calibri" w:eastAsia="Calibri" w:cs="Calibri"/>
-                <w:b/>
-                <w:i w:val="0"/>
-                <w:color w:val="6B7280"/>
-                <w:sz w:val="20"/>
-              </w:rPr>
-              <w:t>{{ edu.graduation_year }}</w:t>
-            </w:r>
-          </w:p>
-          <w:p>
-            <w:pPr>
-              <w:spacing w:after="40"/>
-              <w:ind w:left="240"/>
-              <w:pBdr>
-                <w:left w:val="single" w:sz="24" w:space="6" w:color="1F3A5F"/>
-              </w:pBdr>
-            </w:pPr>
-            <w:r>
-              <w:rPr>
-                <w:rFonts w:ascii="Calibri" w:hAnsi="Calibri" w:eastAsia="Calibri" w:cs="Calibri"/>
-                <w:b/>
-                <w:i w:val="0"/>
-                <w:color w:val="1F3A5F"/>
-                <w:sz w:val="22"/>
-              </w:rPr>
-              <w:t>{{ edu.institution }}</w:t>
-            </w:r>
-          </w:p>
-          <w:p>
-            <w:pPr>
-              <w:spacing w:after="40"/>
-              <w:ind w:left="240"/>
-              <w:pBdr>
-                <w:left w:val="single" w:sz="24" w:space="6" w:color="1F3A5F"/>
-              </w:pBdr>
-            </w:pPr>
-            <w:r>
-              <w:rPr>
-                <w:rFonts w:ascii="Calibri" w:hAnsi="Calibri" w:eastAsia="Calibri" w:cs="Calibri"/>
-                <w:b w:val="0"/>
-                <w:i/>
-                <w:color w:val="2C2C2C"/>
-                <w:sz w:val="20"/>
-              </w:rPr>
-              <w:t>{{ edu.degree }}</w:t>
-            </w:r>
-          </w:p>
-          <w:p>
-            <w:pPr>
-              <w:spacing w:after="160"/>
-              <w:ind w:left="240"/>
-              <w:pBdr>
-                <w:left w:val="single" w:sz="24" w:space="6" w:color="1F3A5F"/>
-              </w:pBdr>
-            </w:pPr>
-            <w:r>
-              <w:rPr>
-                <w:rFonts w:ascii="Calibri" w:hAnsi="Calibri" w:eastAsia="Calibri" w:cs="Calibri"/>
-                <w:b w:val="0"/>
-                <w:i w:val="0"/>
-                <w:color w:val="2C2C2C"/>
-                <w:sz w:val="20"/>
-              </w:rPr>
-              <w:t>Специальность: {{ edu.specialty }}</w:t>
-            </w:r>
-          </w:p>
-          <w:p>
-            <w:pPr>
-              <w:spacing w:after="0"/>
-            </w:pPr>
-            <w:r>
-              <w:t>{% endfor %}{% else %}</w:t>
-            </w:r>
-          </w:p>
-          <w:p>
-            <w:pPr>
-              <w:spacing w:after="0"/>
-            </w:pPr>
-            <w:r>
-              <w:rPr>
-                <w:rFonts w:ascii="Calibri" w:hAnsi="Calibri" w:eastAsia="Calibri" w:cs="Calibri"/>
-                <w:b w:val="0"/>
-                <w:i/>
-                <w:color w:val="6B7280"/>
-                <w:sz w:val="20"/>
-              </w:rPr>
-              <w:t>(не указано)</w:t>
-            </w:r>
-          </w:p>
-          <w:p>
-            <w:pPr>
-              <w:spacing w:after="0"/>
-            </w:pPr>
-            <w:r>
-              <w:t>{% endif %}</w:t>
-            </w:r>
-          </w:p>
-          <w:p>
-            <w:pPr>
-              <w:spacing w:before="200" w:after="80"/>
-              <w:pBdr>
-                <w:bottom w:val="single" w:sz="10" w:space="4" w:color="1F3A5F"/>
-              </w:pBdr>
-            </w:pPr>
-            <w:r>
-              <w:rPr>
-                <w:rFonts w:ascii="Calibri" w:hAnsi="Calibri" w:eastAsia="Calibri" w:cs="Calibri"/>
-                <w:b/>
-                <w:i w:val="0"/>
-                <w:color w:val="1F3A5F"/>
-                <w:sz w:val="24"/>
-              </w:rPr>
-              <w:t>ДОПОЛНИТЕЛЬНАЯ ИНФОРМАЦИЯ</w:t>
-            </w:r>
-          </w:p>
-          <w:p>
-            <w:pPr>
-              <w:spacing w:before="80" w:after="40" w:line="300" w:lineRule="auto"/>
-              <w:ind w:left="400" w:hanging="240"/>
-            </w:pPr>
-            <w:r>
-              <w:rPr>
-                <w:rFonts w:ascii="Calibri" w:hAnsi="Calibri" w:eastAsia="Calibri" w:cs="Calibri"/>
-                <w:b/>
-                <w:i w:val="0"/>
-                <w:color w:val="1F3A5F"/>
-                <w:sz w:val="20"/>
-              </w:rPr>
-              <w:t xml:space="preserve">•  </w:t>
-            </w:r>
-            <w:r>
-              <w:rPr>
-                <w:rFonts w:ascii="Calibri" w:hAnsi="Calibri" w:eastAsia="Calibri" w:cs="Calibri"/>
-                <w:b w:val="0"/>
-                <w:i w:val="0"/>
-                <w:color w:val="2C2C2C"/>
-                <w:sz w:val="20"/>
-              </w:rPr>
-              <w:t>Готов к удалённой работе и переезду</w:t>
-            </w:r>
-          </w:p>
-          <w:p>
-            <w:pPr>
-              <w:spacing w:after="40" w:line="300" w:lineRule="auto"/>
-              <w:ind w:left="400" w:hanging="240"/>
-            </w:pPr>
-            <w:r>
-              <w:t xml:space="preserve">{%p if 'SELF_EMPLOYED' in (application.application_type|string) %}</w:t>
-            </w:r>
-          </w:p>
-          <w:p>
-            <w:pPr>
-              <w:spacing w:after="40" w:line="300" w:lineRule="auto"/>
-              <w:ind w:left="400" w:hanging="240"/>
-            </w:pPr>
-            <w:r>
-              <w:rPr>
-                <w:rFonts w:ascii="Calibri" w:hAnsi="Calibri" w:eastAsia="Calibri" w:cs="Calibri"/>
-                <w:b/>
-                <w:i w:val="0"/>
-                <w:color w:val="1F3A5F"/>
-                <w:sz w:val="20"/>
-              </w:rPr>
-              <w:t xml:space="preserve">•  </w:t>
-            </w:r>
-            <w:r>
-              <w:rPr>
-                <w:rFonts w:ascii="Calibri" w:hAnsi="Calibri" w:eastAsia="Calibri" w:cs="Calibri"/>
-                <w:b w:val="0"/>
-                <w:i w:val="0"/>
-                <w:color w:val="2C2C2C"/>
-                <w:sz w:val="20"/>
-              </w:rPr>
-              <w:t>Самозанятый, плательщик налога на профессиональный доход (НПД)</w:t>
-            </w:r>
-          </w:p>
-          <w:p>
-            <w:pPr>
-              <w:spacing w:after="40" w:line="300" w:lineRule="auto"/>
-              <w:ind w:left="400" w:hanging="240"/>
-            </w:pPr>
-            <w:r>
-              <w:t xml:space="preserve">{%p endif %}</w:t>
-            </w:r>
-          </w:p>
-          <w:p>
-            <w:pPr>
-              <w:spacing w:after="40" w:line="300" w:lineRule="auto"/>
-              <w:ind w:left="400" w:hanging="240"/>
-            </w:pPr>
-            <w:r>
-              <w:rPr>
-                <w:rFonts w:ascii="Calibri" w:hAnsi="Calibri" w:eastAsia="Calibri" w:cs="Calibri"/>
-                <w:b/>
-                <w:i w:val="0"/>
-                <w:color w:val="1F3A5F"/>
-                <w:sz w:val="20"/>
-              </w:rPr>
-              <w:t xml:space="preserve">•  </w:t>
-            </w:r>
-            <w:r>
-              <w:rPr>
-                <w:rFonts w:ascii="Calibri" w:hAnsi="Calibri" w:eastAsia="Calibri" w:cs="Calibri"/>
-                <w:b w:val="0"/>
-                <w:i w:val="0"/>
-                <w:color w:val="2C2C2C"/>
-                <w:sz w:val="20"/>
-              </w:rPr>
-              <w:t>Опыт работы в распределённых командах, навык самостоятельного планирования рабочего времени</w:t>
-            </w:r>
-          </w:p>
-          <w:p>
-            <w:pPr>
-              <w:spacing w:after="40" w:line="300" w:lineRule="auto"/>
-              <w:ind w:left="400" w:hanging="240"/>
-            </w:pPr>
-            <w:r>
-              <w:rPr>
-                <w:rFonts w:ascii="Calibri" w:hAnsi="Calibri" w:eastAsia="Calibri" w:cs="Calibri"/>
-                <w:b/>
-                <w:i w:val="0"/>
-                <w:color w:val="1F3A5F"/>
-                <w:sz w:val="20"/>
-              </w:rPr>
-              <w:t xml:space="preserve">•  </w:t>
-            </w:r>
-            <w:r>
-              <w:rPr>
-                <w:rFonts w:ascii="Calibri" w:hAnsi="Calibri" w:eastAsia="Calibri" w:cs="Calibri"/>
-                <w:b/>
-                <w:i w:val="0"/>
-                <w:color w:val="2C2C2C"/>
-                <w:sz w:val="20"/>
-              </w:rPr>
-              <w:t xml:space="preserve">Иностранные языки: </w:t>
-            </w:r>
-            <w:r>
-              <w:t>{% if applicant.languages %}</w:t>
-            </w:r>
-            <w:r>
-              <w:rPr>
-                <w:rFonts w:ascii="Calibri" w:hAnsi="Calibri" w:eastAsia="Calibri" w:cs="Calibri"/>
-                <w:b w:val="0"/>
-                <w:i w:val="0"/>
-                <w:color w:val="2C2C2C"/>
-                <w:sz w:val="20"/>
-              </w:rPr>
-              <w:t>{{ applicant.languages|join(', ') }}</w:t>
-            </w:r>
-            <w:r>
-              <w:t>{% else %}</w:t>
-            </w:r>
-            <w:r>
-              <w:rPr>
-                <w:rFonts w:ascii="Calibri" w:hAnsi="Calibri" w:eastAsia="Calibri" w:cs="Calibri"/>
-                <w:b w:val="0"/>
-                <w:i w:val="0"/>
-                <w:color w:val="2C2C2C"/>
-                <w:sz w:val="20"/>
-              </w:rPr>
-              <w:t>Русский (свободно), Английский (B2)</w:t>
-            </w:r>
-            <w:r>
-              <w:t>{% endif %}</w:t>
-            </w:r>
-          </w:p>
-        </w:tc>
-      </w:tr>
-    </w:tbl>
+    <w:p>
+      <w:pPr>
+        <w:spacing w:before="0" w:after="40"/>
+        <w:jc w:val="center"/>
+      </w:pPr>
+      <w:r>
+        <w:rPr>
+          <w:rFonts w:ascii="Calibri" w:hAnsi="Calibri" w:cs="Calibri" w:eastAsia="Calibri"/>
+          <w:b w:val="0"/>
+          <w:i w:val="0"/>
+          <w:sz w:val="44"/>
+          <w:spacing w:val="8"/>
+        </w:rPr>
+        <w:t>{{ applicant.full_name_native }}</w:t>
+      </w:r>
+    </w:p>
+    <w:p>
+      <w:pPr>
+        <w:spacing w:before="0" w:after="40"/>
+        <w:jc w:val="center"/>
+      </w:pPr>
+      <w:r>
+        <w:rPr>
+          <w:rFonts w:ascii="Calibri" w:hAnsi="Calibri" w:cs="Calibri" w:eastAsia="Calibri"/>
+          <w:b w:val="0"/>
+          <w:i/>
+          <w:color w:val="4A4A4A"/>
+          <w:sz w:val="22"/>
+        </w:rPr>
+        <w:t>{% if application and application.position %}{{ application.position.title_ru }}{% endif %}</w:t>
+      </w:r>
+    </w:p>
+    <w:p>
+      <w:pPr>
+        <w:spacing w:before="0" w:after="280"/>
+        <w:jc w:val="center"/>
+        <w:pBdr>
+          <w:bottom w:val="single" w:sz="6" w:space="4" w:color="999999"/>
+        </w:pBdr>
+      </w:pPr>
+      <w:r>
+        <w:rPr>
+          <w:rFonts w:ascii="Calibri" w:hAnsi="Calibri" w:cs="Calibri" w:eastAsia="Calibri"/>
+          <w:b w:val="0"/>
+          <w:i w:val="0"/>
+          <w:color w:val="4A4A4A"/>
+          <w:sz w:val="20"/>
+        </w:rPr>
+        <w:t>{{ applicant.phone }}  ·  {{ applicant.email }}</w:t>
+      </w:r>
+    </w:p>
+    <w:p>
+      <w:pPr>
+        <w:spacing w:before="200" w:after="80"/>
+        <w:pBdr>
+          <w:bottom w:val="single" w:sz="4" w:space="4" w:color="CCCCCC"/>
+        </w:pBdr>
+      </w:pPr>
+      <w:r>
+        <w:rPr>
+          <w:rFonts w:ascii="Calibri" w:hAnsi="Calibri" w:cs="Calibri" w:eastAsia="Calibri"/>
+          <w:b/>
+          <w:i w:val="0"/>
+          <w:sz w:val="24"/>
+          <w:spacing w:val="10"/>
+        </w:rPr>
+        <w:t>Личные данные</w:t>
+      </w:r>
+    </w:p>
+    <w:p>
+      <w:pPr>
+        <w:spacing w:before="0" w:after="40"/>
+      </w:pPr>
+      <w:r>
+        <w:rPr>
+          <w:rFonts w:ascii="Calibri" w:hAnsi="Calibri" w:cs="Calibri" w:eastAsia="Calibri"/>
+          <w:b w:val="0"/>
+          <w:i w:val="0"/>
+          <w:color w:val="4A4A4A"/>
+          <w:sz w:val="22"/>
+        </w:rPr>
+        <w:t xml:space="preserve">Дата рождения: </w:t>
+      </w:r>
+      <w:r>
+        <w:rPr>
+          <w:rFonts w:ascii="Calibri" w:hAnsi="Calibri" w:cs="Calibri" w:eastAsia="Calibri"/>
+          <w:b w:val="0"/>
+          <w:i w:val="0"/>
+          <w:sz w:val="22"/>
+        </w:rPr>
+        <w:t>{{ fmt_date_ru(applicant.birth_date) }}</w:t>
+      </w:r>
+    </w:p>
+    <w:p>
+      <w:pPr>
+        <w:spacing w:before="0" w:after="160"/>
+      </w:pPr>
+      <w:r>
+        <w:rPr>
+          <w:rFonts w:ascii="Calibri" w:hAnsi="Calibri" w:cs="Calibri" w:eastAsia="Calibri"/>
+          <w:b w:val="0"/>
+          <w:i w:val="0"/>
+          <w:color w:val="4A4A4A"/>
+          <w:sz w:val="22"/>
+        </w:rPr>
+        <w:t xml:space="preserve">Гражданство: </w:t>
+      </w:r>
+      <w:r>
+        <w:rPr>
+          <w:rFonts w:ascii="Calibri" w:hAnsi="Calibri" w:cs="Calibri" w:eastAsia="Calibri"/>
+          <w:b w:val="0"/>
+          <w:i w:val="0"/>
+          <w:sz w:val="22"/>
+        </w:rPr>
+        <w:t>{{ applicant.nationality_ru }}</w:t>
+      </w:r>
+    </w:p>
+    <w:p>
+      <w:pPr>
+        <w:spacing w:before="200" w:after="80"/>
+        <w:pBdr>
+          <w:bottom w:val="single" w:sz="4" w:space="4" w:color="CCCCCC"/>
+        </w:pBdr>
+      </w:pPr>
+      <w:r>
+        <w:rPr>
+          <w:rFonts w:ascii="Calibri" w:hAnsi="Calibri" w:cs="Calibri" w:eastAsia="Calibri"/>
+          <w:b/>
+          <w:i w:val="0"/>
+          <w:sz w:val="24"/>
+          <w:spacing w:val="10"/>
+        </w:rPr>
+        <w:t>Опыт работы</w:t>
+      </w:r>
+    </w:p>
+    <w:p>
+      <w:pPr>
+        <w:spacing w:before="0" w:after="0"/>
+      </w:pPr>
+      <w:r>
+        <w:t>{%p if applicant.work_history %}</w:t>
+      </w:r>
+    </w:p>
+    <w:p>
+      <w:pPr>
+        <w:spacing w:before="0" w:after="0"/>
+      </w:pPr>
+      <w:r>
+        <w:t>{%p for job in applicant.work_history %}</w:t>
+      </w:r>
+    </w:p>
+    <w:p>
+      <w:pPr>
+        <w:tabs>
+          <w:tab w:pos="9638" w:val="right"/>
+        </w:tabs>
+        <w:spacing w:before="40" w:after="0"/>
+      </w:pPr>
+      <w:r>
+        <w:rPr>
+          <w:rFonts w:ascii="Calibri" w:hAnsi="Calibri" w:cs="Calibri" w:eastAsia="Calibri"/>
+          <w:b/>
+          <w:i w:val="0"/>
+          <w:sz w:val="22"/>
+        </w:rPr>
+        <w:t>{{ job.position }}</w:t>
+      </w:r>
+      <w:r>
+        <w:rPr>
+          <w:rFonts w:ascii="Calibri" w:hAnsi="Calibri" w:cs="Calibri" w:eastAsia="Calibri"/>
+          <w:b w:val="0"/>
+          <w:i w:val="0"/>
+          <w:sz w:val="22"/>
+        </w:rPr>
+        <w:tab/>
+      </w:r>
+      <w:r>
+        <w:rPr>
+          <w:rFonts w:ascii="Calibri" w:hAnsi="Calibri" w:cs="Calibri" w:eastAsia="Calibri"/>
+          <w:b w:val="0"/>
+          <w:i w:val="0"/>
+          <w:color w:val="4A4A4A"/>
+          <w:sz w:val="20"/>
+        </w:rPr>
+        <w:t>{{ job.period_start }} – {{ job.period_end }}</w:t>
+      </w:r>
+    </w:p>
+    <w:p>
+      <w:pPr>
+        <w:spacing w:before="0" w:after="60"/>
+      </w:pPr>
+      <w:r>
+        <w:rPr>
+          <w:rFonts w:ascii="Calibri" w:hAnsi="Calibri" w:cs="Calibri" w:eastAsia="Calibri"/>
+          <w:b w:val="0"/>
+          <w:i/>
+          <w:color w:val="4A4A4A"/>
+          <w:sz w:val="21"/>
+        </w:rPr>
+        <w:t>{{ job.company }}</w:t>
+      </w:r>
+    </w:p>
+    <w:p>
+      <w:pPr>
+        <w:spacing w:before="0" w:after="0"/>
+      </w:pPr>
+      <w:r>
+        <w:t>{%p for duty in job.duties %}</w:t>
+      </w:r>
+    </w:p>
+    <w:p>
+      <w:pPr>
+        <w:spacing w:before="0" w:after="20"/>
+        <w:ind w:left="227"/>
+      </w:pPr>
+      <w:r>
+        <w:rPr>
+          <w:rFonts w:ascii="Calibri" w:hAnsi="Calibri" w:cs="Calibri" w:eastAsia="Calibri"/>
+          <w:b w:val="0"/>
+          <w:i w:val="0"/>
+          <w:sz w:val="21"/>
+        </w:rPr>
+        <w:t>•  {{ duty }}</w:t>
+      </w:r>
+    </w:p>
+    <w:p>
+      <w:pPr>
+        <w:spacing w:before="0" w:after="0"/>
+      </w:pPr>
+      <w:r>
+        <w:t>{%p endfor %}</w:t>
+      </w:r>
+    </w:p>
+    <w:p>
+      <w:pPr>
+        <w:spacing w:before="0" w:after="120"/>
+      </w:pPr>
+    </w:p>
+    <w:p>
+      <w:pPr>
+        <w:spacing w:before="0" w:after="0"/>
+      </w:pPr>
+      <w:r>
+        <w:t>{%p endfor %}</w:t>
+      </w:r>
+    </w:p>
+    <w:p>
+      <w:pPr>
+        <w:spacing w:before="0" w:after="0"/>
+      </w:pPr>
+      <w:r>
+        <w:t>{%p endif %}</w:t>
+      </w:r>
+    </w:p>
+    <w:p>
+      <w:pPr>
+        <w:spacing w:before="200" w:after="80"/>
+        <w:pBdr>
+          <w:bottom w:val="single" w:sz="4" w:space="4" w:color="CCCCCC"/>
+        </w:pBdr>
+      </w:pPr>
+      <w:r>
+        <w:rPr>
+          <w:rFonts w:ascii="Calibri" w:hAnsi="Calibri" w:cs="Calibri" w:eastAsia="Calibri"/>
+          <w:b/>
+          <w:i w:val="0"/>
+          <w:sz w:val="24"/>
+          <w:spacing w:val="10"/>
+        </w:rPr>
+        <w:t>Образование</w:t>
+      </w:r>
+    </w:p>
+    <w:p>
+      <w:pPr>
+        <w:spacing w:before="0" w:after="0"/>
+      </w:pPr>
+      <w:r>
+        <w:t>{%p if applicant.education %}</w:t>
+      </w:r>
+    </w:p>
+    <w:p>
+      <w:pPr>
+        <w:spacing w:before="0" w:after="0"/>
+      </w:pPr>
+      <w:r>
+        <w:t>{%p for edu in applicant.education %}</w:t>
+      </w:r>
+    </w:p>
+    <w:p>
+      <w:pPr>
+        <w:tabs>
+          <w:tab w:pos="9638" w:val="right"/>
+        </w:tabs>
+        <w:spacing w:before="40" w:after="0"/>
+      </w:pPr>
+      <w:r>
+        <w:rPr>
+          <w:rFonts w:ascii="Calibri" w:hAnsi="Calibri" w:cs="Calibri" w:eastAsia="Calibri"/>
+          <w:b/>
+          <w:i w:val="0"/>
+          <w:sz w:val="22"/>
+        </w:rPr>
+        <w:t>{{ edu.degree }} — {{ edu.specialty }}</w:t>
+      </w:r>
+      <w:r>
+        <w:rPr>
+          <w:rFonts w:ascii="Calibri" w:hAnsi="Calibri" w:cs="Calibri" w:eastAsia="Calibri"/>
+          <w:b w:val="0"/>
+          <w:i w:val="0"/>
+          <w:sz w:val="22"/>
+        </w:rPr>
+        <w:tab/>
+      </w:r>
+      <w:r>
+        <w:rPr>
+          <w:rFonts w:ascii="Calibri" w:hAnsi="Calibri" w:cs="Calibri" w:eastAsia="Calibri"/>
+          <w:b w:val="0"/>
+          <w:i w:val="0"/>
+          <w:color w:val="4A4A4A"/>
+          <w:sz w:val="20"/>
+        </w:rPr>
+        <w:t>{{ edu.graduation_year }}</w:t>
+      </w:r>
+    </w:p>
+    <w:p>
+      <w:pPr>
+        <w:spacing w:before="0" w:after="120"/>
+      </w:pPr>
+      <w:r>
+        <w:rPr>
+          <w:rFonts w:ascii="Calibri" w:hAnsi="Calibri" w:cs="Calibri" w:eastAsia="Calibri"/>
+          <w:b w:val="0"/>
+          <w:i/>
+          <w:color w:val="4A4A4A"/>
+          <w:sz w:val="21"/>
+        </w:rPr>
+        <w:t>{{ edu.institution }}</w:t>
+      </w:r>
+    </w:p>
+    <w:p>
+      <w:pPr>
+        <w:spacing w:before="0" w:after="0"/>
+      </w:pPr>
+      <w:r>
+        <w:t>{%p endfor %}</w:t>
+      </w:r>
+    </w:p>
+    <w:p>
+      <w:pPr>
+        <w:spacing w:before="0" w:after="0"/>
+      </w:pPr>
+      <w:r>
+        <w:t>{%p endif %}</w:t>
+      </w:r>
+    </w:p>
+    <w:p>
+      <w:pPr>
+        <w:spacing w:before="200" w:after="80"/>
+        <w:pBdr>
+          <w:bottom w:val="single" w:sz="4" w:space="4" w:color="CCCCCC"/>
+        </w:pBdr>
+      </w:pPr>
+      <w:r>
+        <w:rPr>
+          <w:rFonts w:ascii="Calibri" w:hAnsi="Calibri" w:cs="Calibri" w:eastAsia="Calibri"/>
+          <w:b/>
+          <w:i w:val="0"/>
+          <w:sz w:val="24"/>
+          <w:spacing w:val="10"/>
+        </w:rPr>
+        <w:t>Языки</w:t>
+      </w:r>
+    </w:p>
+    <w:p>
+      <w:pPr>
+        <w:spacing w:before="0" w:after="160"/>
+      </w:pPr>
+      <w:r>
+        <w:rPr>
+          <w:rFonts w:ascii="Calibri" w:hAnsi="Calibri" w:cs="Calibri" w:eastAsia="Calibri"/>
+          <w:b w:val="0"/>
+          <w:i w:val="0"/>
+          <w:sz w:val="22"/>
+        </w:rPr>
+        <w:t>{% if applicant.languages %}{{ applicant.languages|join(' · ') }}{% else %}Русский (свободно) · Английский (B2){% endif %}</w:t>
+      </w:r>
+    </w:p>
+    <w:p>
+      <w:pPr>
+        <w:spacing w:before="200" w:after="80"/>
+        <w:pBdr>
+          <w:bottom w:val="single" w:sz="4" w:space="4" w:color="CCCCCC"/>
+        </w:pBdr>
+      </w:pPr>
+      <w:r>
+        <w:rPr>
+          <w:rFonts w:ascii="Calibri" w:hAnsi="Calibri" w:cs="Calibri" w:eastAsia="Calibri"/>
+          <w:b/>
+          <w:i w:val="0"/>
+          <w:sz w:val="24"/>
+          <w:spacing w:val="10"/>
+        </w:rPr>
+        <w:t>Дополнительная информация</w:t>
+      </w:r>
+    </w:p>
+    <w:p>
+      <w:pPr>
+        <w:spacing w:before="0" w:after="40"/>
+        <w:ind w:left="227"/>
+      </w:pPr>
+      <w:r>
+        <w:rPr>
+          <w:rFonts w:ascii="Calibri" w:hAnsi="Calibri" w:cs="Calibri" w:eastAsia="Calibri"/>
+          <w:b w:val="0"/>
+          <w:i w:val="0"/>
+          <w:sz w:val="21"/>
+        </w:rPr>
+        <w:t>•  Готов к удалённой работе и переезду</w:t>
+      </w:r>
+    </w:p>
+    <w:p>
+      <w:pPr>
+        <w:spacing w:before="0" w:after="0"/>
+      </w:pPr>
+      <w:r>
+        <w:t>{%p if 'SELF_EMPLOYED' in (application.application_type|string) %}</w:t>
+      </w:r>
+    </w:p>
+    <w:p>
+      <w:pPr>
+        <w:spacing w:before="0" w:after="40"/>
+        <w:ind w:left="227"/>
+      </w:pPr>
+      <w:r>
+        <w:rPr>
+          <w:rFonts w:ascii="Calibri" w:hAnsi="Calibri" w:cs="Calibri" w:eastAsia="Calibri"/>
+          <w:b w:val="0"/>
+          <w:i w:val="0"/>
+          <w:sz w:val="21"/>
+        </w:rPr>
+        <w:t>•  Самозанятый, плательщик налога на профессиональный доход (НПД)</w:t>
+      </w:r>
+    </w:p>
+    <w:p>
+      <w:pPr>
+        <w:spacing w:before="0" w:after="0"/>
+      </w:pPr>
+      <w:r>
+        <w:t>{%p endif %}</w:t>
+      </w:r>
+    </w:p>
+    <w:p>
+      <w:pPr>
+        <w:spacing w:before="0" w:after="40"/>
+        <w:ind w:left="227"/>
+      </w:pPr>
+      <w:r>
+        <w:rPr>
+          <w:rFonts w:ascii="Calibri" w:hAnsi="Calibri" w:cs="Calibri" w:eastAsia="Calibri"/>
+          <w:b w:val="0"/>
+          <w:i w:val="0"/>
+          <w:sz w:val="21"/>
+        </w:rPr>
+        <w:t>•  Опыт работы в распределённых командах, навык самостоятельного планирования рабочего времени</w:t>
+      </w:r>
+    </w:p>
     <w:sectPr>
-      <w:pgSz w:w="11906" w:h="16838"/>
-      <w:pgMar w:top="850" w:right="567" w:bottom="850" w:left="567" w:header="720" w:footer="720" w:gutter="0"/>
+      <w:pgSz w:w="12240" w:h="15840"/>
+      <w:pgMar w:top="1020" w:right="1134" w:bottom="1020" w:left="1134" w:header="720" w:footer="720" w:gutter="0"/>
       <w:cols w:space="720"/>
       <w:docGrid w:linePitch="360"/>
     </w:sectPr>

</xml_diff>